<commit_message>
Use the internship certificate dates for Prahadhesvaryaa's report
The Neuberg letter records the internship as 11 May 2026 to 30 July 2026, so
that period now appears on the certificate page, the declaration, the
executive summary, section 2.1 and section 5.1, described as approximately
two and a half months covering twelve working weeks.

Section 2.4 is rebuilt on the real calendar for those dates: twelve
Monday-to-Saturday weeks from 11 May, with the last running 27 to 30 July,
and the seven areas of verification distributed across them.
</commit_message>
<xml_diff>
--- a/Prahadhesvaryaa K S - SIP Report 2026.docx
+++ b/Prahadhesvaryaa K S - SIP Report 2026.docx
@@ -156,7 +156,7 @@
           <wp:inline distT="0" distB="0" distL="0" distR="0">
             <wp:extent cx="5502910" cy="1157773"/>
             <wp:effectExtent l="0" t="0" r="0" b="0"/>
-            <wp:docPr id="57944" name="MUST and ISSM Business School logo"/>
+            <wp:docPr id="30690" name="MUST and ISSM Business School logo"/>
             <wp:cNvGraphicFramePr>
               <a:graphicFrameLocks xmlns:a="http://schemas.openxmlformats.org/drawingml/2006/main" noChangeAspect="1"/>
             </wp:cNvGraphicFramePr>
@@ -280,7 +280,7 @@
         <w:jc w:val="both"/>
       </w:pPr>
       <w:r>
-        <w:t xml:space="preserve">The project was completed under the guidance of Ms. S. Saradha, Chartered Accountant, Internal Audit, Neuberg Diagnostics Private Limited, during the period from May 15th to July 28th, 2026.</w:t>
+        <w:t xml:space="preserve">The project was completed under the guidance of Ms. S. Saradha, Chartered Accountant, Internal Audit, Neuberg Diagnostics Private Limited, during the period from May 11th to July 30th, 2026.</w:t>
       </w:r>
     </w:p>
     <w:p>
@@ -537,7 +537,7 @@
         <w:jc w:val="both"/>
       </w:pPr>
       <w:r>
-        <w:t xml:space="preserve">I, Ms. Prahadhesvaryaa K. S., hereby declare that this SIP Project Report is based on my internship of a little over two months done at Neuberg Diagnostics Private Limited, Chennai, as an Intern in the Internal Audit department, during the period from May 15th to July 28th, 2026, under the guidance of Ms. S. Saradha, Chartered Accountant, Neuberg Diagnostics Private Limited and Indian School of Science and Management, Chennai.</w:t>
+        <w:t xml:space="preserve">I, Ms. Prahadhesvaryaa K. S., hereby declare that this SIP Project Report is based on my internship of approximately two and a half months done at Neuberg Diagnostics Private Limited, Chennai, as an Intern in the Internal Audit department, during the period from May 11th to July 30th, 2026, under the guidance of Ms. S. Saradha, Chartered Accountant, Neuberg Diagnostics Private Limited and Indian School of Science and Management, Chennai.</w:t>
       </w:r>
     </w:p>
     <w:p>
@@ -762,7 +762,7 @@
         <w:jc w:val="both"/>
       </w:pPr>
       <w:r>
-        <w:t xml:space="preserve">This report presents the work carried out during my Summer Internship Programme at Neuberg Diagnostics Private Limited, a Chennai headquartered diagnostics and pathology organisation. The internship was undertaken on-site in the Internal Audit department from 15 May 2026 to 28 July 2026, a period of a little over two months, under the guidance of Ms. S. Saradha, Chartered Accountant.</w:t>
+        <w:t xml:space="preserve">This report presents the work carried out during my Summer Internship Programme at Neuberg Diagnostics Private Limited, a Chennai headquartered diagnostics and pathology organisation. The internship was undertaken on-site in the Internal Audit department from 11 May 2026 to 30 July 2026, a period of approximately two and a half months covering twelve working weeks, under the guidance of Ms. S. Saradha, Chartered Accountant.</w:t>
       </w:r>
     </w:p>
     <w:p>
@@ -1102,7 +1102,7 @@
                 <w:rPr>
                   <w:noProof/>
                 </w:rPr>
-                <w:t>26</w:t>
+                <w:t>27</w:t>
               </w:r>
             </w:fldSimple>
           </w:p>
@@ -1168,7 +1168,7 @@
                 <w:rPr>
                   <w:noProof/>
                 </w:rPr>
-                <w:t>27</w:t>
+                <w:t>28</w:t>
               </w:r>
             </w:fldSimple>
             <w:r>
@@ -1180,72 +1180,6 @@
               <w:t xml:space="preserve">-</w:t>
             </w:r>
             <w:fldSimple w:instr=" PAGEREF ch3_end \h ">
-              <w:r>
-                <w:rPr>
-                  <w:noProof/>
-                </w:rPr>
-                <w:t>32</w:t>
-              </w:r>
-            </w:fldSimple>
-          </w:p>
-        </w:tc>
-      </w:tr>
-      <w:tr>
-        <w:trPr>
-          <w:cantSplit/>
-          <w:trHeight w:val="640" w:hRule="atLeast"/>
-        </w:trPr>
-        <w:tc>
-          <w:tcPr>
-            <w:tcW w:w="1575" w:type="dxa"/>
-            <w:vAlign w:val="center"/>
-          </w:tcPr>
-          <w:p>
-            <w:pPr>
-              <w:spacing w:before="20" w:after="20" w:line="240" w:lineRule="auto"/>
-              <w:jc w:val="center"/>
-            </w:pPr>
-            <w:r>
-              <w:rPr>
-                <w:b/>
-                <w:sz w:val="24"/>
-                <w:szCs w:val="24"/>
-              </w:rPr>
-              <w:t xml:space="preserve">4</w:t>
-            </w:r>
-          </w:p>
-        </w:tc>
-        <w:tc>
-          <w:tcPr>
-            <w:tcW w:w="5514" w:type="dxa"/>
-            <w:vAlign w:val="center"/>
-          </w:tcPr>
-          <w:p>
-            <w:pPr>
-              <w:spacing w:before="20" w:after="20" w:line="240" w:lineRule="auto"/>
-              <w:jc w:val="center"/>
-            </w:pPr>
-            <w:r>
-              <w:rPr>
-                <w:b/>
-                <w:sz w:val="24"/>
-                <w:szCs w:val="24"/>
-              </w:rPr>
-              <w:t xml:space="preserve">LEARNING OUTCOMES</w:t>
-            </w:r>
-          </w:p>
-        </w:tc>
-        <w:tc>
-          <w:tcPr>
-            <w:tcW w:w="1575" w:type="dxa"/>
-            <w:vAlign w:val="center"/>
-          </w:tcPr>
-          <w:p>
-            <w:pPr>
-              <w:spacing w:before="20" w:after="20" w:line="240" w:lineRule="auto"/>
-              <w:jc w:val="center"/>
-            </w:pPr>
-            <w:fldSimple w:instr=" PAGEREF ch4_start \h ">
               <w:r>
                 <w:rPr>
                   <w:noProof/>
@@ -1253,22 +1187,6 @@
                 <w:t>33</w:t>
               </w:r>
             </w:fldSimple>
-            <w:r>
-              <w:rPr>
-                <w:b/>
-                <w:sz w:val="24"/>
-                <w:szCs w:val="24"/>
-              </w:rPr>
-              <w:t xml:space="preserve">-</w:t>
-            </w:r>
-            <w:fldSimple w:instr=" PAGEREF ch4_end \h ">
-              <w:r>
-                <w:rPr>
-                  <w:noProof/>
-                </w:rPr>
-                <w:t>37</w:t>
-              </w:r>
-            </w:fldSimple>
           </w:p>
         </w:tc>
       </w:tr>
@@ -1293,7 +1211,7 @@
                 <w:sz w:val="24"/>
                 <w:szCs w:val="24"/>
               </w:rPr>
-              <w:t xml:space="preserve">5</w:t>
+              <w:t xml:space="preserve">4</w:t>
             </w:r>
           </w:p>
         </w:tc>
@@ -1313,7 +1231,7 @@
                 <w:sz w:val="24"/>
                 <w:szCs w:val="24"/>
               </w:rPr>
-              <w:t xml:space="preserve">SUMMARY AND CONCLUSION</w:t>
+              <w:t xml:space="preserve">LEARNING OUTCOMES</w:t>
             </w:r>
           </w:p>
         </w:tc>
@@ -1327,7 +1245,23 @@
               <w:spacing w:before="20" w:after="20" w:line="240" w:lineRule="auto"/>
               <w:jc w:val="center"/>
             </w:pPr>
-            <w:fldSimple w:instr=" PAGEREF ch5_start \h ">
+            <w:fldSimple w:instr=" PAGEREF ch4_start \h ">
+              <w:r>
+                <w:rPr>
+                  <w:noProof/>
+                </w:rPr>
+                <w:t>34</w:t>
+              </w:r>
+            </w:fldSimple>
+            <w:r>
+              <w:rPr>
+                <w:b/>
+                <w:sz w:val="24"/>
+                <w:szCs w:val="24"/>
+              </w:rPr>
+              <w:t xml:space="preserve">-</w:t>
+            </w:r>
+            <w:fldSimple w:instr=" PAGEREF ch4_end \h ">
               <w:r>
                 <w:rPr>
                   <w:noProof/>
@@ -1335,22 +1269,6 @@
                 <w:t>38</w:t>
               </w:r>
             </w:fldSimple>
-            <w:r>
-              <w:rPr>
-                <w:b/>
-                <w:sz w:val="24"/>
-                <w:szCs w:val="24"/>
-              </w:rPr>
-              <w:t xml:space="preserve">-</w:t>
-            </w:r>
-            <w:fldSimple w:instr=" PAGEREF ch5_end \h ">
-              <w:r>
-                <w:rPr>
-                  <w:noProof/>
-                </w:rPr>
-                <w:t>42</w:t>
-              </w:r>
-            </w:fldSimple>
           </w:p>
         </w:tc>
       </w:tr>
@@ -1375,7 +1293,7 @@
                 <w:sz w:val="24"/>
                 <w:szCs w:val="24"/>
               </w:rPr>
-              <w:t xml:space="preserve">6</w:t>
+              <w:t xml:space="preserve">5</w:t>
             </w:r>
           </w:p>
         </w:tc>
@@ -1395,7 +1313,7 @@
                 <w:sz w:val="24"/>
                 <w:szCs w:val="24"/>
               </w:rPr>
-              <w:t xml:space="preserve">REFERENCES</w:t>
+              <w:t xml:space="preserve">SUMMARY AND CONCLUSION</w:t>
             </w:r>
           </w:p>
         </w:tc>
@@ -1409,7 +1327,23 @@
               <w:spacing w:before="20" w:after="20" w:line="240" w:lineRule="auto"/>
               <w:jc w:val="center"/>
             </w:pPr>
-            <w:fldSimple w:instr=" PAGEREF ch6_start \h ">
+            <w:fldSimple w:instr=" PAGEREF ch5_start \h ">
+              <w:r>
+                <w:rPr>
+                  <w:noProof/>
+                </w:rPr>
+                <w:t>39</w:t>
+              </w:r>
+            </w:fldSimple>
+            <w:r>
+              <w:rPr>
+                <w:b/>
+                <w:sz w:val="24"/>
+                <w:szCs w:val="24"/>
+              </w:rPr>
+              <w:t xml:space="preserve">-</w:t>
+            </w:r>
+            <w:fldSimple w:instr=" PAGEREF ch5_end \h ">
               <w:r>
                 <w:rPr>
                   <w:noProof/>
@@ -1417,6 +1351,72 @@
                 <w:t>43</w:t>
               </w:r>
             </w:fldSimple>
+          </w:p>
+        </w:tc>
+      </w:tr>
+      <w:tr>
+        <w:trPr>
+          <w:cantSplit/>
+          <w:trHeight w:val="640" w:hRule="atLeast"/>
+        </w:trPr>
+        <w:tc>
+          <w:tcPr>
+            <w:tcW w:w="1575" w:type="dxa"/>
+            <w:vAlign w:val="center"/>
+          </w:tcPr>
+          <w:p>
+            <w:pPr>
+              <w:spacing w:before="20" w:after="20" w:line="240" w:lineRule="auto"/>
+              <w:jc w:val="center"/>
+            </w:pPr>
+            <w:r>
+              <w:rPr>
+                <w:b/>
+                <w:sz w:val="24"/>
+                <w:szCs w:val="24"/>
+              </w:rPr>
+              <w:t xml:space="preserve">6</w:t>
+            </w:r>
+          </w:p>
+        </w:tc>
+        <w:tc>
+          <w:tcPr>
+            <w:tcW w:w="5514" w:type="dxa"/>
+            <w:vAlign w:val="center"/>
+          </w:tcPr>
+          <w:p>
+            <w:pPr>
+              <w:spacing w:before="20" w:after="20" w:line="240" w:lineRule="auto"/>
+              <w:jc w:val="center"/>
+            </w:pPr>
+            <w:r>
+              <w:rPr>
+                <w:b/>
+                <w:sz w:val="24"/>
+                <w:szCs w:val="24"/>
+              </w:rPr>
+              <w:t xml:space="preserve">REFERENCES</w:t>
+            </w:r>
+          </w:p>
+        </w:tc>
+        <w:tc>
+          <w:tcPr>
+            <w:tcW w:w="1575" w:type="dxa"/>
+            <w:vAlign w:val="center"/>
+          </w:tcPr>
+          <w:p>
+            <w:pPr>
+              <w:spacing w:before="20" w:after="20" w:line="240" w:lineRule="auto"/>
+              <w:jc w:val="center"/>
+            </w:pPr>
+            <w:fldSimple w:instr=" PAGEREF ch6_start \h ">
+              <w:r>
+                <w:rPr>
+                  <w:noProof/>
+                </w:rPr>
+                <w:t>44</w:t>
+              </w:r>
+            </w:fldSimple>
             <w:r>
               <w:rPr>
                 <w:b/>
@@ -1430,7 +1430,7 @@
                 <w:rPr>
                   <w:noProof/>
                 </w:rPr>
-                <w:t>45</w:t>
+                <w:t>46</w:t>
               </w:r>
             </w:fldSimple>
           </w:p>
@@ -4135,7 +4135,7 @@
         <w:jc w:val="both"/>
       </w:pPr>
       <w:r>
-        <w:t xml:space="preserve">The purpose of the internship was to convert the auditing and internal control concepts studied in the MBA programme into supervised practical work inside a functioning internal audit department. The internship was carried out at Neuberg Diagnostics Private Limited, Chennai, from 15 May 2026 to 28 July 2026, in the Internal Audit department, under the guidance of Ms. S. Saradha, Chartered Accountant.</w:t>
+        <w:t xml:space="preserve">The purpose of the internship was to convert the auditing and internal control concepts studied in the MBA programme into supervised practical work inside a functioning internal audit department. The internship was carried out at Neuberg Diagnostics Private Limited, Chennai, from 15 May 2026 to 30 July 2026, in the Internal Audit department, under the guidance of Ms. S. Saradha, Chartered Accountant.</w:t>
       </w:r>
     </w:p>
     <w:p>
@@ -4978,7 +4978,7 @@
         <w:jc w:val="both"/>
       </w:pPr>
       <w:r>
-        <w:t xml:space="preserve">The internship ran from 15 May 2026 to 28 July 2026. The daily internship diary records the areas of verification as continuing through the whole period, because records for each area became available at different times; the week-by-week account below therefore groups the work by the phase in which each area was principally taken up.</w:t>
+        <w:t xml:space="preserve">The internship ran from 11 May 2026 to 30 July 2026, twelve working weeks in all. The daily internship diary records the areas of verification as continuing through the whole period, because records for each area became available at different times; the week-by-week account below therefore groups the work by the phase in which each area was principally taken up.</w:t>
       </w:r>
     </w:p>
     <w:p>
@@ -4994,7 +4994,7 @@
           <w:sz w:val="24"/>
           <w:szCs w:val="24"/>
         </w:rPr>
-        <w:t xml:space="preserve">Week 1 (15 May – 23 May 2026): Orientation and Internal Audit Induction</w:t>
+        <w:t xml:space="preserve">Week 1 (11 May – 16 May 2026): Orientation and Internal Audit Induction</w:t>
       </w:r>
     </w:p>
     <w:p>
@@ -5033,20 +5033,20 @@
         <w:jc w:val="both"/>
       </w:pPr>
       <w:r>
-        <w:t xml:space="preserve">Was familiarised with Suflam LIMS and shown where bookings, discounts, deletions and payment records are held.</w:t>
-      </w:r>
-    </w:p>
-    <w:p>
-      <w:pPr>
-        <w:numPr>
-          <w:ilvl w:val="0"/>
-          <w:numId w:val="1"/>
-        </w:numPr>
-        <w:spacing w:before="0" w:after="80" w:line="360" w:lineRule="auto"/>
-        <w:jc w:val="both"/>
-      </w:pPr>
-      <w:r>
-        <w:t xml:space="preserve">Studied the company’s discount policy and the authorisation levels applicable to concessions.</w:t>
+        <w:t xml:space="preserve">Was familiarised with Suflam LIMS and shown where bookings, laboratory identification numbers, discounts, deletions and payment records are held.</w:t>
+      </w:r>
+    </w:p>
+    <w:p>
+      <w:pPr>
+        <w:numPr>
+          <w:ilvl w:val="0"/>
+          <w:numId w:val="1"/>
+        </w:numPr>
+        <w:spacing w:before="0" w:after="80" w:line="360" w:lineRule="auto"/>
+        <w:jc w:val="both"/>
+      </w:pPr>
+      <w:r>
+        <w:t xml:space="preserve">Studied the company’s discount policy and the authorisation levels applicable to concessions and free of cost services.</w:t>
       </w:r>
     </w:p>
     <w:p>
@@ -5067,7 +5067,7 @@
           <w:sz w:val="24"/>
           <w:szCs w:val="24"/>
         </w:rPr>
-        <w:t xml:space="preserve">Week 2 (25 May – 30 May 2026): B2B KYC Verification</w:t>
+        <w:t xml:space="preserve">Week 2 (18 May – 23 May 2026): B2B KYC Verification</w:t>
       </w:r>
     </w:p>
     <w:p>
@@ -5127,7 +5127,7 @@
           <w:sz w:val="24"/>
           <w:szCs w:val="24"/>
         </w:rPr>
-        <w:t xml:space="preserve">Week 3 (1 June – 6 June 2026): B2B Documentation and TRF Verification</w:t>
+        <w:t xml:space="preserve">Week 3 (25 May – 30 May 2026): B2B Documentation and Eligibility</w:t>
       </w:r>
     </w:p>
     <w:p>
@@ -5153,20 +5153,20 @@
         <w:jc w:val="both"/>
       </w:pPr>
       <w:r>
-        <w:t xml:space="preserve">Took up verification of Test Requisition Forms received from different branches.</w:t>
-      </w:r>
-    </w:p>
-    <w:p>
-      <w:pPr>
-        <w:numPr>
-          <w:ilvl w:val="0"/>
-          <w:numId w:val="1"/>
-        </w:numPr>
-        <w:spacing w:before="0" w:after="80" w:line="360" w:lineRule="auto"/>
-        <w:jc w:val="both"/>
-      </w:pPr>
-      <w:r>
-        <w:t xml:space="preserve">Verified whether the B2B bills were sealed with the respective laboratory name and noted the cases in which the seal was missing.</w:t>
+        <w:t xml:space="preserve">Verified that the clients on record were eligible for the business-to-business benefits being extended to them.</w:t>
+      </w:r>
+    </w:p>
+    <w:p>
+      <w:pPr>
+        <w:numPr>
+          <w:ilvl w:val="0"/>
+          <w:numId w:val="1"/>
+        </w:numPr>
+        <w:spacing w:before="0" w:after="80" w:line="360" w:lineRule="auto"/>
+        <w:jc w:val="both"/>
+      </w:pPr>
+      <w:r>
+        <w:t xml:space="preserve">Learned how verification of business credentials distinguishes a genuine B2B client from a B2C customer.</w:t>
       </w:r>
     </w:p>
     <w:p>
@@ -5187,46 +5187,46 @@
           <w:sz w:val="24"/>
           <w:szCs w:val="24"/>
         </w:rPr>
-        <w:t xml:space="preserve">Week 4 (8 June – 13 June 2026): Deep Discount Verification</w:t>
-      </w:r>
-    </w:p>
-    <w:p>
-      <w:pPr>
-        <w:numPr>
-          <w:ilvl w:val="0"/>
-          <w:numId w:val="1"/>
-        </w:numPr>
-        <w:spacing w:before="0" w:after="80" w:line="360" w:lineRule="auto"/>
-        <w:jc w:val="both"/>
-      </w:pPr>
-      <w:r>
-        <w:t xml:space="preserve">Identified walk-in customers who had received discounts of more than thirty per cent.</w:t>
-      </w:r>
-    </w:p>
-    <w:p>
-      <w:pPr>
-        <w:numPr>
-          <w:ilvl w:val="0"/>
-          <w:numId w:val="1"/>
-        </w:numPr>
-        <w:spacing w:before="0" w:after="80" w:line="360" w:lineRule="auto"/>
-        <w:jc w:val="both"/>
-      </w:pPr>
-      <w:r>
-        <w:t xml:space="preserve">Cross-checked those cases against the company’s discount policy to establish whether the concession was authorised.</w:t>
-      </w:r>
-    </w:p>
-    <w:p>
-      <w:pPr>
-        <w:numPr>
-          <w:ilvl w:val="0"/>
-          <w:numId w:val="1"/>
-        </w:numPr>
-        <w:spacing w:before="0" w:after="80" w:line="360" w:lineRule="auto"/>
-        <w:jc w:val="both"/>
-      </w:pPr>
-      <w:r>
-        <w:t xml:space="preserve">Recorded the exceptions for further verification by the team and continued TRF verification alongside.</w:t>
+        <w:t xml:space="preserve">Week 4 (1 June – 6 June 2026): Test Requisition Form Verification</w:t>
+      </w:r>
+    </w:p>
+    <w:p>
+      <w:pPr>
+        <w:numPr>
+          <w:ilvl w:val="0"/>
+          <w:numId w:val="1"/>
+        </w:numPr>
+        <w:spacing w:before="0" w:after="80" w:line="360" w:lineRule="auto"/>
+        <w:jc w:val="both"/>
+      </w:pPr>
+      <w:r>
+        <w:t xml:space="preserve">Took up verification of Test Requisition Forms received from different branches.</w:t>
+      </w:r>
+    </w:p>
+    <w:p>
+      <w:pPr>
+        <w:numPr>
+          <w:ilvl w:val="0"/>
+          <w:numId w:val="1"/>
+        </w:numPr>
+        <w:spacing w:before="0" w:after="80" w:line="360" w:lineRule="auto"/>
+        <w:jc w:val="both"/>
+      </w:pPr>
+      <w:r>
+        <w:t xml:space="preserve">Verified whether the B2B bills were sealed with the respective laboratory name and noted the cases in which the seal was missing.</w:t>
+      </w:r>
+    </w:p>
+    <w:p>
+      <w:pPr>
+        <w:numPr>
+          <w:ilvl w:val="0"/>
+          <w:numId w:val="1"/>
+        </w:numPr>
+        <w:spacing w:before="0" w:after="80" w:line="360" w:lineRule="auto"/>
+        <w:jc w:val="both"/>
+      </w:pPr>
+      <w:r>
+        <w:t xml:space="preserve">Passed the details of the incomplete forms to the audit team so that the branches concerned could be asked to regularise them.</w:t>
       </w:r>
     </w:p>
     <w:p>
@@ -5247,46 +5247,46 @@
           <w:sz w:val="24"/>
           <w:szCs w:val="24"/>
         </w:rPr>
-        <w:t xml:space="preserve">Week 5 (15 June – 20 June 2026): Free of Cost Verification</w:t>
-      </w:r>
-    </w:p>
-    <w:p>
-      <w:pPr>
-        <w:numPr>
-          <w:ilvl w:val="0"/>
-          <w:numId w:val="1"/>
-        </w:numPr>
-        <w:spacing w:before="0" w:after="80" w:line="360" w:lineRule="auto"/>
-        <w:jc w:val="both"/>
-      </w:pPr>
-      <w:r>
-        <w:t xml:space="preserve">Checked records to identify walk-in and B2B customers who had been given a hundred per cent discount.</w:t>
-      </w:r>
-    </w:p>
-    <w:p>
-      <w:pPr>
-        <w:numPr>
-          <w:ilvl w:val="0"/>
-          <w:numId w:val="1"/>
-        </w:numPr>
-        <w:spacing w:before="0" w:after="80" w:line="360" w:lineRule="auto"/>
-        <w:jc w:val="both"/>
-      </w:pPr>
-      <w:r>
-        <w:t xml:space="preserve">Verified the basis and authorisation for each free of cost case and recorded them for review.</w:t>
-      </w:r>
-    </w:p>
-    <w:p>
-      <w:pPr>
-        <w:numPr>
-          <w:ilvl w:val="0"/>
-          <w:numId w:val="1"/>
-        </w:numPr>
-        <w:spacing w:before="0" w:after="80" w:line="360" w:lineRule="auto"/>
-        <w:jc w:val="both"/>
-      </w:pPr>
-      <w:r>
-        <w:t xml:space="preserve">Observed how free services and deep discounts together indicate the extent of concessions being granted at branch level.</w:t>
+        <w:t xml:space="preserve">Week 5 (8 June – 13 June 2026): Deep Discount Verification</w:t>
+      </w:r>
+    </w:p>
+    <w:p>
+      <w:pPr>
+        <w:numPr>
+          <w:ilvl w:val="0"/>
+          <w:numId w:val="1"/>
+        </w:numPr>
+        <w:spacing w:before="0" w:after="80" w:line="360" w:lineRule="auto"/>
+        <w:jc w:val="both"/>
+      </w:pPr>
+      <w:r>
+        <w:t xml:space="preserve">Identified walk-in customers who had received discounts of more than thirty per cent.</w:t>
+      </w:r>
+    </w:p>
+    <w:p>
+      <w:pPr>
+        <w:numPr>
+          <w:ilvl w:val="0"/>
+          <w:numId w:val="1"/>
+        </w:numPr>
+        <w:spacing w:before="0" w:after="80" w:line="360" w:lineRule="auto"/>
+        <w:jc w:val="both"/>
+      </w:pPr>
+      <w:r>
+        <w:t xml:space="preserve">Cross-checked those cases against the company’s discount policy to establish whether the concession was authorised.</w:t>
+      </w:r>
+    </w:p>
+    <w:p>
+      <w:pPr>
+        <w:numPr>
+          <w:ilvl w:val="0"/>
+          <w:numId w:val="1"/>
+        </w:numPr>
+        <w:spacing w:before="0" w:after="80" w:line="360" w:lineRule="auto"/>
+        <w:jc w:val="both"/>
+      </w:pPr>
+      <w:r>
+        <w:t xml:space="preserve">Recorded the exceptions for further verification by the team and continued TRF verification alongside.</w:t>
       </w:r>
     </w:p>
     <w:p>
@@ -5307,46 +5307,46 @@
           <w:sz w:val="24"/>
           <w:szCs w:val="24"/>
         </w:rPr>
-        <w:t xml:space="preserve">Week 6 (22 June – 27 June 2026): Cash Due Monitoring</w:t>
-      </w:r>
-    </w:p>
-    <w:p>
-      <w:pPr>
-        <w:numPr>
-          <w:ilvl w:val="0"/>
-          <w:numId w:val="1"/>
-        </w:numPr>
-        <w:spacing w:before="0" w:after="80" w:line="360" w:lineRule="auto"/>
-        <w:jc w:val="both"/>
-      </w:pPr>
-      <w:r>
-        <w:t xml:space="preserve">Reviewed payment records to establish outstanding amounts.</w:t>
-      </w:r>
-    </w:p>
-    <w:p>
-      <w:pPr>
-        <w:numPr>
-          <w:ilvl w:val="0"/>
-          <w:numId w:val="1"/>
-        </w:numPr>
-        <w:spacing w:before="0" w:after="80" w:line="360" w:lineRule="auto"/>
-        <w:jc w:val="both"/>
-      </w:pPr>
-      <w:r>
-        <w:t xml:space="preserve">Calculated the number of days between the payment date and the current date to identify the cash due status.</w:t>
-      </w:r>
-    </w:p>
-    <w:p>
-      <w:pPr>
-        <w:numPr>
-          <w:ilvl w:val="0"/>
-          <w:numId w:val="1"/>
-        </w:numPr>
-        <w:spacing w:before="0" w:after="80" w:line="360" w:lineRule="auto"/>
-        <w:jc w:val="both"/>
-      </w:pPr>
-      <w:r>
-        <w:t xml:space="preserve">Presented the ageing position so that older dues could be taken up first with the branches and clients concerned.</w:t>
+        <w:t xml:space="preserve">Week 6 (15 June – 20 June 2026): Free of Cost Verification</w:t>
+      </w:r>
+    </w:p>
+    <w:p>
+      <w:pPr>
+        <w:numPr>
+          <w:ilvl w:val="0"/>
+          <w:numId w:val="1"/>
+        </w:numPr>
+        <w:spacing w:before="0" w:after="80" w:line="360" w:lineRule="auto"/>
+        <w:jc w:val="both"/>
+      </w:pPr>
+      <w:r>
+        <w:t xml:space="preserve">Checked records to identify walk-in and B2B customers who had been given a hundred per cent discount.</w:t>
+      </w:r>
+    </w:p>
+    <w:p>
+      <w:pPr>
+        <w:numPr>
+          <w:ilvl w:val="0"/>
+          <w:numId w:val="1"/>
+        </w:numPr>
+        <w:spacing w:before="0" w:after="80" w:line="360" w:lineRule="auto"/>
+        <w:jc w:val="both"/>
+      </w:pPr>
+      <w:r>
+        <w:t xml:space="preserve">Verified the basis and authorisation for each free of cost case and recorded them for review.</w:t>
+      </w:r>
+    </w:p>
+    <w:p>
+      <w:pPr>
+        <w:numPr>
+          <w:ilvl w:val="0"/>
+          <w:numId w:val="1"/>
+        </w:numPr>
+        <w:spacing w:before="0" w:after="80" w:line="360" w:lineRule="auto"/>
+        <w:jc w:val="both"/>
+      </w:pPr>
+      <w:r>
+        <w:t xml:space="preserve">Observed how free services and deep discounts together indicate the extent of concessions being granted at branch level.</w:t>
       </w:r>
     </w:p>
     <w:p>
@@ -5367,46 +5367,46 @@
           <w:sz w:val="24"/>
           <w:szCs w:val="24"/>
         </w:rPr>
-        <w:t xml:space="preserve">Week 7 (29 June – 4 July 2026): Service Deletion Verification</w:t>
-      </w:r>
-    </w:p>
-    <w:p>
-      <w:pPr>
-        <w:numPr>
-          <w:ilvl w:val="0"/>
-          <w:numId w:val="1"/>
-        </w:numPr>
-        <w:spacing w:before="0" w:after="80" w:line="360" w:lineRule="auto"/>
-        <w:jc w:val="both"/>
-      </w:pPr>
-      <w:r>
-        <w:t xml:space="preserve">Reviewed deleted service records to identify tests booked by customers and later removed from the system.</w:t>
-      </w:r>
-    </w:p>
-    <w:p>
-      <w:pPr>
-        <w:numPr>
-          <w:ilvl w:val="0"/>
-          <w:numId w:val="1"/>
-        </w:numPr>
-        <w:spacing w:before="0" w:after="80" w:line="360" w:lineRule="auto"/>
-        <w:jc w:val="both"/>
-      </w:pPr>
-      <w:r>
-        <w:t xml:space="preserve">Traced the respective laboratory identification numbers and examined who had deleted each service.</w:t>
-      </w:r>
-    </w:p>
-    <w:p>
-      <w:pPr>
-        <w:numPr>
-          <w:ilvl w:val="0"/>
-          <w:numId w:val="1"/>
-        </w:numPr>
-        <w:spacing w:before="0" w:after="80" w:line="360" w:lineRule="auto"/>
-        <w:jc w:val="both"/>
-      </w:pPr>
-      <w:r>
-        <w:t xml:space="preserve">Checked the reason recorded for each deletion and listed the cases in which no adequate reason was available.</w:t>
+        <w:t xml:space="preserve">Week 7 (22 June – 27 June 2026): Cash Due Monitoring</w:t>
+      </w:r>
+    </w:p>
+    <w:p>
+      <w:pPr>
+        <w:numPr>
+          <w:ilvl w:val="0"/>
+          <w:numId w:val="1"/>
+        </w:numPr>
+        <w:spacing w:before="0" w:after="80" w:line="360" w:lineRule="auto"/>
+        <w:jc w:val="both"/>
+      </w:pPr>
+      <w:r>
+        <w:t xml:space="preserve">Reviewed payment records to establish outstanding amounts.</w:t>
+      </w:r>
+    </w:p>
+    <w:p>
+      <w:pPr>
+        <w:numPr>
+          <w:ilvl w:val="0"/>
+          <w:numId w:val="1"/>
+        </w:numPr>
+        <w:spacing w:before="0" w:after="80" w:line="360" w:lineRule="auto"/>
+        <w:jc w:val="both"/>
+      </w:pPr>
+      <w:r>
+        <w:t xml:space="preserve">Calculated the number of days between the payment date and the current date to identify the cash due status.</w:t>
+      </w:r>
+    </w:p>
+    <w:p>
+      <w:pPr>
+        <w:numPr>
+          <w:ilvl w:val="0"/>
+          <w:numId w:val="1"/>
+        </w:numPr>
+        <w:spacing w:before="0" w:after="80" w:line="360" w:lineRule="auto"/>
+        <w:jc w:val="both"/>
+      </w:pPr>
+      <w:r>
+        <w:t xml:space="preserve">Presented the ageing position so that older dues could be taken up first with the branches and clients concerned.</w:t>
       </w:r>
     </w:p>
     <w:p>
@@ -5427,46 +5427,46 @@
           <w:sz w:val="24"/>
           <w:szCs w:val="24"/>
         </w:rPr>
-        <w:t xml:space="preserve">Week 8 (6 July – 11 July 2026): Action Taken Report Follow-Up</w:t>
-      </w:r>
-    </w:p>
-    <w:p>
-      <w:pPr>
-        <w:numPr>
-          <w:ilvl w:val="0"/>
-          <w:numId w:val="1"/>
-        </w:numPr>
-        <w:spacing w:before="0" w:after="80" w:line="360" w:lineRule="auto"/>
-        <w:jc w:val="both"/>
-      </w:pPr>
-      <w:r>
-        <w:t xml:space="preserve">Began follow-up of Action Taken Reports for branch audits, contacting branch staff by telephone to collect the evidence needed to close observations.</w:t>
-      </w:r>
-    </w:p>
-    <w:p>
-      <w:pPr>
-        <w:numPr>
-          <w:ilvl w:val="0"/>
-          <w:numId w:val="1"/>
-        </w:numPr>
-        <w:spacing w:before="0" w:after="80" w:line="360" w:lineRule="auto"/>
-        <w:jc w:val="both"/>
-      </w:pPr>
-      <w:r>
-        <w:t xml:space="preserve">Recorded the responses received and updated the pending and completed status of each observation.</w:t>
-      </w:r>
-    </w:p>
-    <w:p>
-      <w:pPr>
-        <w:numPr>
-          <w:ilvl w:val="0"/>
-          <w:numId w:val="1"/>
-        </w:numPr>
-        <w:spacing w:before="0" w:after="80" w:line="360" w:lineRule="auto"/>
-        <w:jc w:val="both"/>
-      </w:pPr>
-      <w:r>
-        <w:t xml:space="preserve">Learned how an observation moves from being raised to being closed, and why closure requires evidence rather than assurance.</w:t>
+        <w:t xml:space="preserve">Week 8 (29 June – 4 July 2026): Service Deletion Verification</w:t>
+      </w:r>
+    </w:p>
+    <w:p>
+      <w:pPr>
+        <w:numPr>
+          <w:ilvl w:val="0"/>
+          <w:numId w:val="1"/>
+        </w:numPr>
+        <w:spacing w:before="0" w:after="80" w:line="360" w:lineRule="auto"/>
+        <w:jc w:val="both"/>
+      </w:pPr>
+      <w:r>
+        <w:t xml:space="preserve">Reviewed deleted service records to identify tests booked by customers and later removed from the system.</w:t>
+      </w:r>
+    </w:p>
+    <w:p>
+      <w:pPr>
+        <w:numPr>
+          <w:ilvl w:val="0"/>
+          <w:numId w:val="1"/>
+        </w:numPr>
+        <w:spacing w:before="0" w:after="80" w:line="360" w:lineRule="auto"/>
+        <w:jc w:val="both"/>
+      </w:pPr>
+      <w:r>
+        <w:t xml:space="preserve">Traced the respective laboratory identification numbers and examined who had deleted each service.</w:t>
+      </w:r>
+    </w:p>
+    <w:p>
+      <w:pPr>
+        <w:numPr>
+          <w:ilvl w:val="0"/>
+          <w:numId w:val="1"/>
+        </w:numPr>
+        <w:spacing w:before="0" w:after="80" w:line="360" w:lineRule="auto"/>
+        <w:jc w:val="both"/>
+      </w:pPr>
+      <w:r>
+        <w:t xml:space="preserve">Checked the reason recorded for each deletion and listed the cases in which no adequate reason was available.</w:t>
       </w:r>
     </w:p>
     <w:p>
@@ -5487,46 +5487,46 @@
           <w:sz w:val="24"/>
           <w:szCs w:val="24"/>
         </w:rPr>
-        <w:t xml:space="preserve">Week 9 (13 July – 18 July 2026): Continued Follow-Up and Recurring Verifications</w:t>
-      </w:r>
-    </w:p>
-    <w:p>
-      <w:pPr>
-        <w:numPr>
-          <w:ilvl w:val="0"/>
-          <w:numId w:val="1"/>
-        </w:numPr>
-        <w:spacing w:before="0" w:after="80" w:line="360" w:lineRule="auto"/>
-        <w:jc w:val="both"/>
-      </w:pPr>
-      <w:r>
-        <w:t xml:space="preserve">Continued the ATR follow-up and escalated observations on which no response had been received.</w:t>
-      </w:r>
-    </w:p>
-    <w:p>
-      <w:pPr>
-        <w:numPr>
-          <w:ilvl w:val="0"/>
-          <w:numId w:val="1"/>
-        </w:numPr>
-        <w:spacing w:before="0" w:after="80" w:line="360" w:lineRule="auto"/>
-        <w:jc w:val="both"/>
-      </w:pPr>
-      <w:r>
-        <w:t xml:space="preserve">Carried out the recurring verifications for the period, covering deep discounts, free of cost cases and deletions.</w:t>
-      </w:r>
-    </w:p>
-    <w:p>
-      <w:pPr>
-        <w:numPr>
-          <w:ilvl w:val="0"/>
-          <w:numId w:val="1"/>
-        </w:numPr>
-        <w:spacing w:before="0" w:after="80" w:line="360" w:lineRule="auto"/>
-        <w:jc w:val="both"/>
-      </w:pPr>
-      <w:r>
-        <w:t xml:space="preserve">Updated the KYC and TRF records with the documents received during the week.</w:t>
+        <w:t xml:space="preserve">Week 9 (6 July – 11 July 2026): Action Taken Report Follow-Up</w:t>
+      </w:r>
+    </w:p>
+    <w:p>
+      <w:pPr>
+        <w:numPr>
+          <w:ilvl w:val="0"/>
+          <w:numId w:val="1"/>
+        </w:numPr>
+        <w:spacing w:before="0" w:after="80" w:line="360" w:lineRule="auto"/>
+        <w:jc w:val="both"/>
+      </w:pPr>
+      <w:r>
+        <w:t xml:space="preserve">Began follow-up of Action Taken Reports for branch audits, contacting branch staff by telephone to collect the evidence needed to close observations.</w:t>
+      </w:r>
+    </w:p>
+    <w:p>
+      <w:pPr>
+        <w:numPr>
+          <w:ilvl w:val="0"/>
+          <w:numId w:val="1"/>
+        </w:numPr>
+        <w:spacing w:before="0" w:after="80" w:line="360" w:lineRule="auto"/>
+        <w:jc w:val="both"/>
+      </w:pPr>
+      <w:r>
+        <w:t xml:space="preserve">Recorded the responses received and updated the pending and completed status of each observation.</w:t>
+      </w:r>
+    </w:p>
+    <w:p>
+      <w:pPr>
+        <w:numPr>
+          <w:ilvl w:val="0"/>
+          <w:numId w:val="1"/>
+        </w:numPr>
+        <w:spacing w:before="0" w:after="80" w:line="360" w:lineRule="auto"/>
+        <w:jc w:val="both"/>
+      </w:pPr>
+      <w:r>
+        <w:t xml:space="preserve">Learned how an observation moves from being raised to being closed, and why closure requires evidence rather than assurance.</w:t>
       </w:r>
     </w:p>
     <w:p>
@@ -5547,46 +5547,46 @@
           <w:sz w:val="24"/>
           <w:szCs w:val="24"/>
         </w:rPr>
-        <w:t xml:space="preserve">Week 10 (20 July – 25 July 2026): Consolidation of Exception Records</w:t>
-      </w:r>
-    </w:p>
-    <w:p>
-      <w:pPr>
-        <w:numPr>
-          <w:ilvl w:val="0"/>
-          <w:numId w:val="1"/>
-        </w:numPr>
-        <w:spacing w:before="0" w:after="80" w:line="360" w:lineRule="auto"/>
-        <w:jc w:val="both"/>
-      </w:pPr>
-      <w:r>
-        <w:t xml:space="preserve">Consolidated the exceptions identified across discounts, free of cost cases, deletions and TRF seals into the formats used by the department.</w:t>
-      </w:r>
-    </w:p>
-    <w:p>
-      <w:pPr>
-        <w:numPr>
-          <w:ilvl w:val="0"/>
-          <w:numId w:val="1"/>
-        </w:numPr>
-        <w:spacing w:before="0" w:after="80" w:line="360" w:lineRule="auto"/>
-        <w:jc w:val="both"/>
-      </w:pPr>
-      <w:r>
-        <w:t xml:space="preserve">Reconciled the cash due position with the latest payment records.</w:t>
-      </w:r>
-    </w:p>
-    <w:p>
-      <w:pPr>
-        <w:numPr>
-          <w:ilvl w:val="0"/>
-          <w:numId w:val="1"/>
-        </w:numPr>
-        <w:spacing w:before="0" w:after="80" w:line="360" w:lineRule="auto"/>
-        <w:jc w:val="both"/>
-      </w:pPr>
-      <w:r>
-        <w:t xml:space="preserve">Submitted the consolidated working sheets for review and made the corrections indicated.</w:t>
+        <w:t xml:space="preserve">Week 10 (13 July – 18 July 2026): Continued Follow-Up and Recurring Verifications</w:t>
+      </w:r>
+    </w:p>
+    <w:p>
+      <w:pPr>
+        <w:numPr>
+          <w:ilvl w:val="0"/>
+          <w:numId w:val="1"/>
+        </w:numPr>
+        <w:spacing w:before="0" w:after="80" w:line="360" w:lineRule="auto"/>
+        <w:jc w:val="both"/>
+      </w:pPr>
+      <w:r>
+        <w:t xml:space="preserve">Continued the ATR follow-up and escalated observations on which no response had been received.</w:t>
+      </w:r>
+    </w:p>
+    <w:p>
+      <w:pPr>
+        <w:numPr>
+          <w:ilvl w:val="0"/>
+          <w:numId w:val="1"/>
+        </w:numPr>
+        <w:spacing w:before="0" w:after="80" w:line="360" w:lineRule="auto"/>
+        <w:jc w:val="both"/>
+      </w:pPr>
+      <w:r>
+        <w:t xml:space="preserve">Carried out the recurring verifications for the period, covering deep discounts, free of cost cases and deletions.</w:t>
+      </w:r>
+    </w:p>
+    <w:p>
+      <w:pPr>
+        <w:numPr>
+          <w:ilvl w:val="0"/>
+          <w:numId w:val="1"/>
+        </w:numPr>
+        <w:spacing w:before="0" w:after="80" w:line="360" w:lineRule="auto"/>
+        <w:jc w:val="both"/>
+      </w:pPr>
+      <w:r>
+        <w:t xml:space="preserve">Updated the KYC and TRF records with the documents received during the week.</w:t>
       </w:r>
     </w:p>
     <w:p>
@@ -5607,7 +5607,67 @@
           <w:sz w:val="24"/>
           <w:szCs w:val="24"/>
         </w:rPr>
-        <w:t xml:space="preserve">Week 11 (27 July – 28 July 2026): Closure and Handover</w:t>
+        <w:t xml:space="preserve">Week 11 (20 July – 25 July 2026): Consolidation of Exception Records</w:t>
+      </w:r>
+    </w:p>
+    <w:p>
+      <w:pPr>
+        <w:numPr>
+          <w:ilvl w:val="0"/>
+          <w:numId w:val="1"/>
+        </w:numPr>
+        <w:spacing w:before="0" w:after="80" w:line="360" w:lineRule="auto"/>
+        <w:jc w:val="both"/>
+      </w:pPr>
+      <w:r>
+        <w:t xml:space="preserve">Consolidated the exceptions identified across discounts, free of cost cases, deletions and TRF seals into the formats used by the department.</w:t>
+      </w:r>
+    </w:p>
+    <w:p>
+      <w:pPr>
+        <w:numPr>
+          <w:ilvl w:val="0"/>
+          <w:numId w:val="1"/>
+        </w:numPr>
+        <w:spacing w:before="0" w:after="80" w:line="360" w:lineRule="auto"/>
+        <w:jc w:val="both"/>
+      </w:pPr>
+      <w:r>
+        <w:t xml:space="preserve">Reconciled the cash due position with the latest payment records.</w:t>
+      </w:r>
+    </w:p>
+    <w:p>
+      <w:pPr>
+        <w:numPr>
+          <w:ilvl w:val="0"/>
+          <w:numId w:val="1"/>
+        </w:numPr>
+        <w:spacing w:before="0" w:after="80" w:line="360" w:lineRule="auto"/>
+        <w:jc w:val="both"/>
+      </w:pPr>
+      <w:r>
+        <w:t xml:space="preserve">Submitted the consolidated working sheets for review and made the corrections indicated.</w:t>
+      </w:r>
+    </w:p>
+    <w:p>
+      <w:pPr>
+        <w:spacing w:before="0" w:after="60" w:line="120" w:lineRule="auto"/>
+      </w:pPr>
+    </w:p>
+    <w:p>
+      <w:pPr>
+        <w:keepNext/>
+        <w:keepLines/>
+        <w:spacing w:before="180" w:after="100" w:line="360" w:lineRule="auto"/>
+        <w:jc w:val="left"/>
+      </w:pPr>
+      <w:r>
+        <w:rPr>
+          <w:b/>
+          <w:sz w:val="24"/>
+          <w:szCs w:val="24"/>
+        </w:rPr>
+        <w:t xml:space="preserve">Week 12 (27 July – 30 July 2026): Closure and Handover</w:t>
       </w:r>
     </w:p>
     <w:p>
@@ -6335,7 +6395,7 @@
         <w:jc w:val="both"/>
       </w:pPr>
       <w:r>
-        <w:t xml:space="preserve">Seven areas of verification, each with its own logic and format, had to be learned within a little over two months, and I developed the habit of noting the steps of a process immediately after it was demonstrated so that I could repeat it unaided.</w:t>
+        <w:t xml:space="preserve">Seven areas of verification, each with its own logic and format, had to be learned within twelve weeks, and I developed the habit of noting the steps of a process immediately after it was demonstrated so that I could repeat it unaided.</w:t>
       </w:r>
     </w:p>
     <w:p>
@@ -9585,7 +9645,7 @@
         <w:jc w:val="both"/>
       </w:pPr>
       <w:r>
-        <w:t xml:space="preserve">The Summer Internship Programme was carried out at Neuberg Diagnostics Private Limited, Chennai, on-site in the Internal Audit department, from 15 May 2026 to 28 July 2026, under the guidance of Ms. S. Saradha, Chartered Accountant. The work concerned the verification of revenue-side controls in a multi-branch diagnostics network.</w:t>
+        <w:t xml:space="preserve">The Summer Internship Programme was carried out at Neuberg Diagnostics Private Limited, Chennai, on-site in the Internal Audit department, from 11 May 2026 to 30 July 2026, under the guidance of Ms. S. Saradha, Chartered Accountant. The work concerned the verification of revenue-side controls in a multi-branch diagnostics network.</w:t>
       </w:r>
     </w:p>
     <w:p>
@@ -10022,7 +10082,7 @@
         <w:jc w:val="both"/>
       </w:pPr>
       <w:r>
-        <w:t xml:space="preserve">The internship at Neuberg Diagnostics Private Limited was the point at which my study of finance became practical. Over a little over two months I moved from being shown how a verification is performed to carrying out the recurring checks independently, consolidating exception records and following up audit observations with branches directly. In doing so I acquired a set of skills that are directly employable: verification against policy, KYC and documentation review, discount and free of cost testing, receivables ageing, examination of system amendments and deletions, exception reporting and audit follow-up.</w:t>
+        <w:t xml:space="preserve">The internship at Neuberg Diagnostics Private Limited was the point at which my study of finance became practical. Over twelve weeks I moved from being shown how a verification is performed to carrying out the recurring checks independently, consolidating exception records and following up audit observations with branches directly. In doing so I acquired a set of skills that are directly employable: verification against policy, KYC and documentation review, discount and free of cost testing, receivables ageing, examination of system amendments and deletions, exception reporting and audit follow-up.</w:t>
       </w:r>
     </w:p>
     <w:p>

</xml_diff>